<commit_message>
Rebuild the store manual with the new contact address, and note that the support contact is not sent by the API
- store/ストア提出手順.docx / .pdf still had nakamura@hi.u-tokyo.ac.jp after #27
  (the builder was fixed but the files were not regenerated). Rebuilt them.
- The support contact and privacy policy URL shown on the Store page live in
  Partner Center's Properties, not in the submission JSON of API v1
  (baseListing.supportContact / privacyPolicy are empty in the published
  submission). store_submit.py cannot change them; noted where it matters.
- Privacy policy URL now points at https://ap.ldas.jp/ (the github.io URL
  redirects there since #26).
- build_manual.py writes next to itself instead of an absolute path, so it
  works from a worktree.

Co-Authored-By: Claude Opus 5.5 <noreply@anthropic.com>
</commit_message>
<xml_diff>
--- a/store/ストア提出手順.docx
+++ b/store/ストア提出手順.docx
@@ -214,7 +214,7 @@
           <w:rFonts w:ascii="Menlo" w:hAnsi="Menlo" w:eastAsia="Menlo"/>
           <w:sz w:val="18"/>
         </w:rPr>
-        <w:t>https://github.com/nakamura196/archival-packager-x/releases/tag/v0.1.0</w:t>
+        <w:t>https://github.com/nakamura196/archival-packager/releases/tag/v0.1.0</w:t>
       </w:r>
     </w:p>
     <w:p>
@@ -645,7 +645,7 @@
           <w:rFonts w:ascii="Menlo" w:hAnsi="Menlo" w:eastAsia="Menlo"/>
           <w:sz w:val="18"/>
         </w:rPr>
-        <w:t>https://nakamura196.github.io/archival-packager-x/privacy-policy.html</w:t>
+        <w:t>https://ap.ldas.jp/privacy-policy.html</w:t>
       </w:r>
     </w:p>
     <w:p>
@@ -693,7 +693,7 @@
           <w:rFonts w:ascii="Menlo" w:hAnsi="Menlo" w:eastAsia="Menlo"/>
           <w:sz w:val="18"/>
         </w:rPr>
-        <w:t>nakamura@hi.u-tokyo.ac.jp</w:t>
+        <w:t>nakamura.satoru@mail.u-tokyo.ac.jp</w:t>
       </w:r>
     </w:p>
     <w:p>
@@ -2437,7 +2437,7 @@
           <w:rFonts w:ascii="Menlo" w:hAnsi="Menlo" w:eastAsia="Menlo"/>
           <w:sz w:val="18"/>
         </w:rPr>
-        <w:t>https://nakamura196.github.io/archival-packager-x/privacy-policy.html</w:t>
+        <w:t>https://ap.ldas.jp/privacy-policy.html</w:t>
       </w:r>
     </w:p>
     <w:p>

</xml_diff>

<commit_message>
Rebuild the store manual with the new contact address, and note that the support contact is not sent by the API (#29)
- store/ストア提出手順.docx / .pdf still had nakamura@hi.u-tokyo.ac.jp after #27
  (the builder was fixed but the files were not regenerated). Rebuilt them.
- The support contact and privacy policy URL shown on the Store page live in
  Partner Center's Properties, not in the submission JSON of API v1
  (baseListing.supportContact / privacyPolicy are empty in the published
  submission). store_submit.py cannot change them; noted where it matters.
- Privacy policy URL now points at https://ap.ldas.jp/ (the github.io URL
  redirects there since #26).
- build_manual.py writes next to itself instead of an absolute path, so it
  works from a worktree.

Co-authored-by: Claude Opus 5.5 <noreply@anthropic.com>
</commit_message>
<xml_diff>
--- a/store/ストア提出手順.docx
+++ b/store/ストア提出手順.docx
@@ -214,7 +214,7 @@
           <w:rFonts w:ascii="Menlo" w:hAnsi="Menlo" w:eastAsia="Menlo"/>
           <w:sz w:val="18"/>
         </w:rPr>
-        <w:t>https://github.com/nakamura196/archival-packager-x/releases/tag/v0.1.0</w:t>
+        <w:t>https://github.com/nakamura196/archival-packager/releases/tag/v0.1.0</w:t>
       </w:r>
     </w:p>
     <w:p>
@@ -645,7 +645,7 @@
           <w:rFonts w:ascii="Menlo" w:hAnsi="Menlo" w:eastAsia="Menlo"/>
           <w:sz w:val="18"/>
         </w:rPr>
-        <w:t>https://nakamura196.github.io/archival-packager-x/privacy-policy.html</w:t>
+        <w:t>https://ap.ldas.jp/privacy-policy.html</w:t>
       </w:r>
     </w:p>
     <w:p>
@@ -693,7 +693,7 @@
           <w:rFonts w:ascii="Menlo" w:hAnsi="Menlo" w:eastAsia="Menlo"/>
           <w:sz w:val="18"/>
         </w:rPr>
-        <w:t>nakamura@hi.u-tokyo.ac.jp</w:t>
+        <w:t>nakamura.satoru@mail.u-tokyo.ac.jp</w:t>
       </w:r>
     </w:p>
     <w:p>
@@ -2437,7 +2437,7 @@
           <w:rFonts w:ascii="Menlo" w:hAnsi="Menlo" w:eastAsia="Menlo"/>
           <w:sz w:val="18"/>
         </w:rPr>
-        <w:t>https://nakamura196.github.io/archival-packager-x/privacy-policy.html</w:t>
+        <w:t>https://ap.ldas.jp/privacy-policy.html</w:t>
       </w:r>
     </w:p>
     <w:p>

</xml_diff>